<commit_message>
fix: Correccion nombre del sistema e indice de tabla
</commit_message>
<xml_diff>
--- a/TI.1.4. PAO202651_RESTFUL_DOTNET_SINBDD_NRC36884_GR07/01. UML/01. ERS/ERS_RESTFUL_DOTNET_SINBDD_GR07.docx
+++ b/TI.1.4. PAO202651_RESTFUL_DOTNET_SINBDD_NRC36884_GR07/01. UML/01. ERS/ERS_RESTFUL_DOTNET_SINBDD_GR07.docx
@@ -8194,7 +8194,21 @@
         <w:rPr>
           <w:rStyle w:val="16"/>
         </w:rPr>
-        <w:t>Tabla 31. Requerimiento no funcional Protocolo de Arquitectura (SOAP)</w:t>
+        <w:t>Tabla 31. Requerimiento no funcional Protocolo de Arquitectura (</w:t>
+      </w:r>
+      <w:r>
+        <w:rPr>
+          <w:rStyle w:val="16"/>
+          <w:rFonts w:hint="default"/>
+          <w:lang w:val="es-EC"/>
+        </w:rPr>
+        <w:t>RESTFUL</w:t>
+      </w:r>
+      <w:r>
+        <w:rPr>
+          <w:rStyle w:val="16"/>
+        </w:rPr>
+        <w:t>)</w:t>
       </w:r>
       <w:r>
         <w:tab/>
@@ -9068,8 +9082,8 @@
       <w:pPr>
         <w:pStyle w:val="63"/>
       </w:pPr>
-      <w:bookmarkStart w:id="16" w:name="_Toc242174923"/>
-      <w:bookmarkStart w:id="17" w:name="_Toc83812944"/>
+      <w:bookmarkStart w:id="16" w:name="_Toc83812944"/>
+      <w:bookmarkStart w:id="17" w:name="_Toc242174923"/>
       <w:r>
         <w:t xml:space="preserve">Tabla </w:t>
       </w:r>
@@ -9129,6 +9143,12 @@
             <w:insideH w:val="single" w:color="95B3D7" w:themeColor="accent1" w:themeTint="99" w:sz="4" w:space="0"/>
             <w:insideV w:val="single" w:color="95B3D7" w:themeColor="accent1" w:themeTint="99" w:sz="4" w:space="0"/>
           </w:tblBorders>
+          <w:tblCellMar>
+            <w:top w:w="0" w:type="dxa"/>
+            <w:left w:w="108" w:type="dxa"/>
+            <w:bottom w:w="0" w:type="dxa"/>
+            <w:right w:w="108" w:type="dxa"/>
+          </w:tblCellMar>
         </w:tblPrEx>
         <w:tc>
           <w:tcPr>
@@ -9590,12 +9610,6 @@
             <w:insideH w:val="single" w:color="95B3D7" w:themeColor="accent1" w:themeTint="99" w:sz="4" w:space="0"/>
             <w:insideV w:val="single" w:color="95B3D7" w:themeColor="accent1" w:themeTint="99" w:sz="4" w:space="0"/>
           </w:tblBorders>
-          <w:tblCellMar>
-            <w:top w:w="0" w:type="dxa"/>
-            <w:left w:w="108" w:type="dxa"/>
-            <w:bottom w:w="0" w:type="dxa"/>
-            <w:right w:w="108" w:type="dxa"/>
-          </w:tblCellMar>
         </w:tblPrEx>
         <w:tc>
           <w:tcPr>
@@ -10755,8 +10769,8 @@
       <w:pPr>
         <w:pStyle w:val="63"/>
       </w:pPr>
-      <w:bookmarkStart w:id="29" w:name="_Toc83812946"/>
-      <w:bookmarkStart w:id="30" w:name="_Toc242174925"/>
+      <w:bookmarkStart w:id="29" w:name="_Toc242174925"/>
+      <w:bookmarkStart w:id="30" w:name="_Toc83812946"/>
       <w:r>
         <w:t xml:space="preserve">Tabla </w:t>
       </w:r>
@@ -16184,8 +16198,8 @@
       <w:pPr>
         <w:pStyle w:val="63"/>
       </w:pPr>
-      <w:bookmarkStart w:id="72" w:name="_Toc242174931"/>
-      <w:bookmarkStart w:id="73" w:name="_Toc83812961"/>
+      <w:bookmarkStart w:id="72" w:name="_Toc83812961"/>
+      <w:bookmarkStart w:id="73" w:name="_Toc242174931"/>
       <w:r>
         <w:t xml:space="preserve">Tabla </w:t>
       </w:r>
@@ -24521,15 +24535,10 @@
     </w:p>
     <w:p>
       <w:r>
-        <w:t>Para el Sistema “</w:t>
-      </w:r>
-      <w:r>
-        <w:rPr>
-          <w:rFonts w:hint="default"/>
-          <w:lang w:val="es-EC"/>
-        </w:rPr>
-        <w:t>Convertidor de Unidades Monster</w:t>
-      </w:r>
+        <w:t>Para el Sistema “Conversión de Unidades Monster</w:t>
+      </w:r>
+      <w:bookmarkStart w:id="137" w:name="_GoBack"/>
+      <w:bookmarkEnd w:id="137"/>
       <w:r>
         <w:t>” se ha identificado los siguientes requerimientos no funcionales en relación con la tecnología de la información.</w:t>
       </w:r>
@@ -25274,8 +25283,6 @@
               </w:rPr>
               <w:t>ASP</w:t>
             </w:r>
-            <w:bookmarkStart w:id="137" w:name="_GoBack"/>
-            <w:bookmarkEnd w:id="137"/>
             <w:r>
               <w:rPr>
                 <w:rFonts w:ascii="Arial" w:hAnsi="Arial"/>
@@ -27538,8 +27545,8 @@
       </w:pPr>
       <w:bookmarkStart w:id="111" w:name="_2xcytpi"/>
       <w:bookmarkEnd w:id="111"/>
-      <w:bookmarkStart w:id="112" w:name="_Toc58077511"/>
-      <w:bookmarkStart w:id="113" w:name="_Toc697"/>
+      <w:bookmarkStart w:id="112" w:name="_Toc697"/>
+      <w:bookmarkStart w:id="113" w:name="_Toc58077511"/>
       <w:r>
         <w:t>8.4.2 Restricciones de Hardware</w:t>
       </w:r>
@@ -27707,9 +27714,9 @@
       <w:pPr>
         <w:pStyle w:val="2"/>
       </w:pPr>
-      <w:bookmarkStart w:id="116" w:name="_Toc58077513"/>
-      <w:bookmarkStart w:id="117" w:name="_Toc23846806"/>
-      <w:bookmarkStart w:id="118" w:name="_Toc13660"/>
+      <w:bookmarkStart w:id="116" w:name="_Toc23846806"/>
+      <w:bookmarkStart w:id="117" w:name="_Toc13660"/>
+      <w:bookmarkStart w:id="118" w:name="_Toc58077513"/>
       <w:r>
         <w:t>9. Requisitos de Rendimiento</w:t>
       </w:r>
@@ -27722,8 +27729,8 @@
         <w:pStyle w:val="3"/>
       </w:pPr>
       <w:bookmarkStart w:id="119" w:name="_Toc23846807"/>
-      <w:bookmarkStart w:id="120" w:name="_Toc58077514"/>
-      <w:bookmarkStart w:id="121" w:name="_Toc12308"/>
+      <w:bookmarkStart w:id="120" w:name="_Toc12308"/>
+      <w:bookmarkStart w:id="121" w:name="_Toc58077514"/>
       <w:r>
         <w:t>9.1. Requisitos de Interfaces Externas</w:t>
       </w:r>
@@ -27970,8 +27977,8 @@
       <w:pPr>
         <w:pStyle w:val="4"/>
       </w:pPr>
-      <w:bookmarkStart w:id="128" w:name="_Toc58077518"/>
-      <w:bookmarkStart w:id="129" w:name="_Toc9230"/>
+      <w:bookmarkStart w:id="128" w:name="_Toc9230"/>
+      <w:bookmarkStart w:id="129" w:name="_Toc58077518"/>
       <w:r>
         <w:t>9.1.4. Interfaces de Comunicación</w:t>
       </w:r>
@@ -28053,8 +28060,8 @@
       <w:pPr>
         <w:pStyle w:val="37"/>
       </w:pPr>
-      <w:bookmarkStart w:id="133" w:name="_Toc58077521"/>
-      <w:bookmarkStart w:id="134" w:name="_Toc3247"/>
+      <w:bookmarkStart w:id="133" w:name="_Toc3247"/>
+      <w:bookmarkStart w:id="134" w:name="_Toc58077521"/>
       <w:r>
         <w:t>CONCLUSIONES</w:t>
       </w:r>

</xml_diff>